<commit_message>
Regenerate CSVs and .docx reports for March 2026
- Regenerated input/clients.csv, holdings.csv, transactions.csv from data/clients.py
- Regenerated Albert's monthly report .docx (now March 2026, Selic 15%, BCB signaling cuts)
- Regenerated workflow_report.docx with current data
- Removed stale Ricardo report (was from old session)

Co-Authored-By: Claude Opus 4.6 <noreply@anthropic.com>
</commit_message>
<xml_diff>
--- a/output/monthly_report_albert_da_silva.docx
+++ b/output/monthly_report_albert_da_silva.docx
@@ -4,43 +4,7 @@
   <w:body>
     <w:p>
       <w:pPr>
-        <w:jc w:val="left"/>
-      </w:pPr>
-      <w:r>
-        <w:rPr>
-          <w:b/>
-          <w:color w:val="1A1A2E"/>
-          <w:sz w:val="36"/>
-        </w:rPr>
-        <w:t>XP Investimentos</w:t>
-      </w:r>
-    </w:p>
-    <w:p>
-      <w:pPr>
-        <w:jc w:val="left"/>
-      </w:pPr>
-      <w:r>
-        <w:rPr>
-          <w:color w:val="6B7B8F"/>
-          <w:sz w:val="20"/>
-        </w:rPr>
-        <w:t>Assessoria de Investimentos</w:t>
-      </w:r>
-    </w:p>
-    <w:p>
-      <w:pPr>
-        <w:jc w:val="left"/>
-      </w:pPr>
-      <w:r>
-        <w:rPr>
-          <w:color w:val="EDB92E"/>
-          <w:sz w:val="12"/>
-        </w:rPr>
-        <w:t>________________________________________________________________________________</w:t>
-      </w:r>
-    </w:p>
-    <w:p>
-      <w:pPr>
+        <w:spacing w:after="0"/>
         <w:jc w:val="left"/>
       </w:pPr>
       <w:r>
@@ -48,322 +12,403 @@
           <w:rFonts w:ascii="Calibri" w:hAnsi="Calibri"/>
           <w:b/>
           <w:color w:val="1A1A2E"/>
-          <w:sz w:val="28"/>
+          <w:sz w:val="32"/>
         </w:rPr>
-        <w:t>Carta Mensal de Investimentos — Fevereiro/2026</w:t>
+        <w:t>XP Investimentos</w:t>
       </w:r>
-    </w:p>
-    <w:p/>
-    <w:p>
+      <w:r>
+        <w:rPr>
+          <w:sz w:val="12"/>
+        </w:rPr>
+        <w:br/>
+      </w:r>
       <w:r>
         <w:rPr>
           <w:rFonts w:ascii="Calibri" w:hAnsi="Calibri"/>
-          <w:color w:val="333333"/>
-          <w:sz w:val="21"/>
+          <w:color w:val="6B7B8F"/>
+          <w:sz w:val="18"/>
         </w:rPr>
-        <w:t>Prezado(a) Albert da Silva,</w:t>
+        <w:t>Assessoria de Investimentos</w:t>
       </w:r>
     </w:p>
-    <w:p/>
     <w:p>
+      <w:pPr>
+        <w:spacing w:before="40" w:after="120"/>
+      </w:pPr>
       <w:r>
         <w:rPr>
           <w:rFonts w:ascii="Calibri" w:hAnsi="Calibri"/>
-          <w:color w:val="333333"/>
-          <w:sz w:val="21"/>
+          <w:color w:val="EDB92E"/>
+          <w:sz w:val="10"/>
         </w:rPr>
-        <w:t>Espero que esteja bem. Apresento a seguir o relatório mensal de sua carteira de investimentos, referente ao mês de fevereiro de 2026.</w:t>
+        <w:t>__________________________________________________________________________________________</w:t>
       </w:r>
     </w:p>
-    <w:p/>
     <w:p>
+      <w:pPr>
+        <w:spacing w:line="276" w:lineRule="auto" w:before="0" w:after="120"/>
+        <w:jc w:val="left"/>
+      </w:pPr>
       <w:r>
         <w:rPr>
           <w:rFonts w:ascii="Calibri" w:hAnsi="Calibri"/>
           <w:b/>
           <w:color w:val="1A1A2E"/>
-          <w:sz w:val="22"/>
+          <w:sz w:val="24"/>
         </w:rPr>
-        <w:t>Cenário Macroeconômico</w:t>
+        <w:t>Carta Mensal de Investimentos — Março/2026</w:t>
       </w:r>
     </w:p>
-    <w:p/>
     <w:p>
+      <w:pPr>
+        <w:spacing w:line="276" w:lineRule="auto" w:before="80" w:after="80"/>
+      </w:pPr>
       <w:r>
         <w:rPr>
           <w:rFonts w:ascii="Calibri" w:hAnsi="Calibri"/>
           <w:color w:val="333333"/>
-          <w:sz w:val="21"/>
+          <w:sz w:val="20"/>
         </w:rPr>
-        <w:t>O mês de fevereiro foi marcado por um cenário de cautela nos mercados. O Comitê de Política Monetária (Copom) elevou a taxa Selic para 14.25% ao ano, reforçando o compromisso com o controle da inflação, que acumula 5.2% em 12 meses. A economia brasileira mostra sinais de desaceleração, com projeção de crescimento de 2.0% para 2025, ante 3.6% registrado em 2024. O câmbio operou com volatilidade, com o dólar cotado a R$5.85.</w:t>
+        <w:t>Prezado(a) Albert da Silva,</w:t>
       </w:r>
     </w:p>
-    <w:p/>
     <w:p>
+      <w:pPr>
+        <w:spacing w:line="276" w:lineRule="auto" w:before="40" w:after="40"/>
+      </w:pPr>
       <w:r>
         <w:rPr>
           <w:rFonts w:ascii="Calibri" w:hAnsi="Calibri"/>
           <w:color w:val="333333"/>
-          <w:sz w:val="21"/>
+          <w:sz w:val="20"/>
         </w:rPr>
-        <w:t>No cenário internacional, a política tarifária dos EUA continuou gerando incerteza, enquanto o Federal Reserve manteve os juros estáveis diante de uma inflação persistente.</w:t>
+        <w:t>Espero que esteja bem. Apresento a seguir o relatório mensal de sua carteira de investimentos, com os principais destaques do mês de março de 2026. Como sempre, nosso objetivo é manter você informado sobre o desempenho de seus investimentos e as perspectivas para os próximos meses.</w:t>
       </w:r>
     </w:p>
-    <w:p/>
     <w:p>
+      <w:pPr>
+        <w:spacing w:line="276" w:lineRule="auto" w:before="160" w:after="40"/>
+      </w:pPr>
       <w:r>
         <w:rPr>
           <w:rFonts w:ascii="Calibri" w:hAnsi="Calibri"/>
           <w:b/>
           <w:color w:val="1A1A2E"/>
-          <w:sz w:val="22"/>
+          <w:sz w:val="21"/>
         </w:rPr>
-        <w:t>Desempenho da Carteira</w:t>
+        <w:t>Cenário Macroeconômico</w:t>
       </w:r>
     </w:p>
-    <w:p/>
     <w:p>
+      <w:pPr>
+        <w:spacing w:line="276" w:lineRule="auto" w:before="40" w:after="40"/>
+      </w:pPr>
       <w:r>
         <w:rPr>
           <w:rFonts w:ascii="Calibri" w:hAnsi="Calibri"/>
           <w:color w:val="333333"/>
-          <w:sz w:val="21"/>
+          <w:sz w:val="20"/>
         </w:rPr>
-        <w:t>Sua carteira apresentou rentabilidade de -2.35% no mês, ficando abaixo do o CDI de 1.07% em 3.42 pontos percentuais. No acumulado do ano, o retorno é de -5.10%, e nos últimos 12 meses, de -8.40%.</w:t>
+        <w:t>O mês de março de 2026 foi marcado por uma importante mudança na política monetária brasileira. Com a taxa Selic em 15.0% ao ano, o Banco Central sinalizou o início de um ciclo de afrouxamento monetário. A XP projeta 5 cortes consecutivos de 0,50 p.p. a partir deste mês, levando a Selic a 12,50% ao final de 2026. A inflação acumula 3.95% em 12 meses, com projeção de 3,8% para 2026. A economia brasileira encerrou 2025 com crescimento de 2.3%, e a projeção para 2026 é de 2.0%.</w:t>
       </w:r>
     </w:p>
-    <w:p/>
     <w:p>
+      <w:pPr>
+        <w:spacing w:line="276" w:lineRule="auto" w:before="40" w:after="40"/>
+      </w:pPr>
       <w:r>
         <w:rPr>
           <w:rFonts w:ascii="Calibri" w:hAnsi="Calibri"/>
           <w:color w:val="333333"/>
-          <w:sz w:val="21"/>
+          <w:sz w:val="20"/>
         </w:rPr>
-        <w:t>O portfólio mantém uma alocação diversificada e alinhada ao seu perfil Moderado, com exposição equilibrada entre as diferentes classes de ativos. A parcela de renda fixa continua se beneficiando do ambiente de juros elevados, enquanto a exposição a renda variável foi impactada pela volatilidade do período.</w:t>
+        <w:t>No cenário externo, as tensões entre EUA e Irã elevaram o petróleo a cerca de US$80/barril, enquanto fluxos recordes para mercados emergentes impulsionaram o Ibovespa a uma alta acumulada de aproximadamente 20% no ano. O real se apreciou significativamente, com o dólar cotado a R$5.1, beneficiado pela rotação global para ativos emergentes.</w:t>
       </w:r>
     </w:p>
-    <w:p/>
     <w:p>
+      <w:pPr>
+        <w:spacing w:line="276" w:lineRule="auto" w:before="160" w:after="40"/>
+      </w:pPr>
       <w:r>
         <w:rPr>
           <w:rFonts w:ascii="Calibri" w:hAnsi="Calibri"/>
           <w:b/>
           <w:color w:val="1A1A2E"/>
-          <w:sz w:val="22"/>
+          <w:sz w:val="21"/>
         </w:rPr>
-        <w:t>Posicionamento e Perspectivas</w:t>
+        <w:t>Desempenho da Carteira</w:t>
       </w:r>
     </w:p>
-    <w:p/>
     <w:p>
+      <w:pPr>
+        <w:spacing w:line="276" w:lineRule="auto" w:before="40" w:after="40"/>
+      </w:pPr>
       <w:r>
         <w:rPr>
           <w:rFonts w:ascii="Calibri" w:hAnsi="Calibri"/>
           <w:color w:val="333333"/>
+          <w:sz w:val="20"/>
+        </w:rPr>
+        <w:t>Em março de 2026, sua carteira apresentou rentabilidade de -0.25%, ficando abaixo do CDI de 1.17% em 1.42 pontos percentuais. No acumulado do ano (janeiro-março/2026), o retorno é de 1.85%, e nos últimos 12 meses, de 2.80%. A perspectiva de início do ciclo de cortes na Selic tende a beneficiar posições em renda fixa prefixada e FIIs, enquanto o forte rali das ações brasileiras contribuiu positivamente para as posições em renda variável.</w:t>
+      </w:r>
+    </w:p>
+    <w:p>
+      <w:pPr>
+        <w:spacing w:line="276" w:lineRule="auto" w:before="160" w:after="40"/>
+      </w:pPr>
+      <w:r>
+        <w:rPr>
+          <w:rFonts w:ascii="Calibri" w:hAnsi="Calibri"/>
+          <w:b/>
+          <w:color w:val="1A1A2E"/>
           <w:sz w:val="21"/>
         </w:rPr>
-        <w:t>A alocação em Renda Fixa encontra-se acima do target para o perfil Moderado (70.8% vs. 45% alvo). Pode ser oportuno avaliar uma redução gradual de aproximadamente R$99,964 nesta classe.</w:t>
+        <w:t>Rentabilidade Mensal das Ações</w:t>
       </w:r>
     </w:p>
-    <w:p/>
     <w:p>
+      <w:pPr>
+        <w:spacing w:line="240" w:lineRule="auto" w:before="0" w:after="20"/>
+        <w:ind w:left="283"/>
+      </w:pPr>
       <w:r>
         <w:rPr>
           <w:rFonts w:ascii="Calibri" w:hAnsi="Calibri"/>
           <w:color w:val="333333"/>
-          <w:sz w:val="21"/>
+          <w:sz w:val="18"/>
         </w:rPr>
-        <w:t>A alocação em FIIs está abaixo do nível sugerido para o perfil Moderado (0.0% vs. 15% alvo). Considerando o cenário atual, pode ser interessante avaliar um incremento de aproximadamente R$58,029.</w:t>
+        <w:t>- LREN3 (Lojas Renner): valorização de 4.3% no mês</w:t>
       </w:r>
     </w:p>
-    <w:p/>
     <w:p>
+      <w:pPr>
+        <w:spacing w:line="240" w:lineRule="auto" w:before="0" w:after="20"/>
+        <w:ind w:left="283"/>
+      </w:pPr>
       <w:r>
         <w:rPr>
           <w:rFonts w:ascii="Calibri" w:hAnsi="Calibri"/>
           <w:color w:val="333333"/>
-          <w:sz w:val="21"/>
+          <w:sz w:val="18"/>
         </w:rPr>
-        <w:t>A alocação em Internacional está abaixo do nível sugerido para o perfil Moderado (0.0% vs. 12% alvo). Considerando o cenário atual, pode ser interessante avaliar um incremento de aproximadamente R$46,423.</w:t>
+        <w:t>- MRFG3 (Marfrig): desvalorização de 4.9% no mês</w:t>
       </w:r>
     </w:p>
-    <w:p/>
     <w:p>
+      <w:pPr>
+        <w:spacing w:line="240" w:lineRule="auto" w:before="0" w:after="20"/>
+        <w:ind w:left="283"/>
+      </w:pPr>
       <w:r>
         <w:rPr>
           <w:rFonts w:ascii="Calibri" w:hAnsi="Calibri"/>
           <w:color w:val="333333"/>
-          <w:sz w:val="21"/>
+          <w:sz w:val="18"/>
         </w:rPr>
-        <w:t>A posição em Hapvida (HAPV3) apresenta uma desvalorização de -74.6% em relação ao preço médio. É recomendável uma revisão desta posição à luz da tese original de investimento.</w:t>
+        <w:t>- ARZZ3 (Arezzo): desvalorização de 4.7% no mês</w:t>
       </w:r>
     </w:p>
-    <w:p/>
     <w:p>
+      <w:pPr>
+        <w:spacing w:line="240" w:lineRule="auto" w:before="0" w:after="20"/>
+        <w:ind w:left="283"/>
+      </w:pPr>
       <w:r>
         <w:rPr>
           <w:rFonts w:ascii="Calibri" w:hAnsi="Calibri"/>
           <w:color w:val="333333"/>
+          <w:sz w:val="18"/>
+        </w:rPr>
+        <w:t>- HAPV3 (Hapvida): desvalorização de 19.3% no mês</w:t>
+      </w:r>
+    </w:p>
+    <w:p>
+      <w:pPr>
+        <w:spacing w:line="276" w:lineRule="auto" w:before="160" w:after="40"/>
+      </w:pPr>
+      <w:r>
+        <w:rPr>
+          <w:rFonts w:ascii="Calibri" w:hAnsi="Calibri"/>
+          <w:b/>
+          <w:color w:val="1A1A2E"/>
           <w:sz w:val="21"/>
         </w:rPr>
-        <w:t>A posição em Lojas Renner (LREN3) apresenta uma desvalorização de -41.7% em relação ao preço médio. É recomendável uma revisão desta posição à luz da tese original de investimento.</w:t>
+        <w:t>Posicionamento e Recomendações</w:t>
       </w:r>
     </w:p>
-    <w:p/>
     <w:p>
+      <w:pPr>
+        <w:spacing w:line="276" w:lineRule="auto" w:before="40" w:after="40"/>
+      </w:pPr>
       <w:r>
         <w:rPr>
           <w:rFonts w:ascii="Calibri" w:hAnsi="Calibri"/>
           <w:color w:val="333333"/>
-          <w:sz w:val="21"/>
+          <w:sz w:val="20"/>
         </w:rPr>
-        <w:t>A posição em Arezzo (ARZZ3) apresenta uma desvalorização de -31.1% em relação ao preço médio. É recomendável uma revisão desta posição à luz da tese original de investimento.</w:t>
+        <w:t>Com base na análise do seu perfil Moderate e nas condições atuais de mercado de março de 2026, destacamos os seguintes pontos de atenção:</w:t>
       </w:r>
     </w:p>
-    <w:p/>
     <w:p>
+      <w:pPr>
+        <w:spacing w:line="276" w:lineRule="auto" w:before="40" w:after="40"/>
+      </w:pPr>
       <w:r>
         <w:rPr>
           <w:rFonts w:ascii="Calibri" w:hAnsi="Calibri"/>
           <w:color w:val="333333"/>
-          <w:sz w:val="21"/>
+          <w:sz w:val="20"/>
         </w:rPr>
-        <w:t>A posição em Constellation Institucional Advisory FIC FIA (CONST-FIA) apresenta uma desvalorização de -25.7% em relação ao preço médio. É recomendável uma revisão desta posição à luz da tese original de investimento.</w:t>
+        <w:t>A alocação em Fixed Income encontra-se acima do target para o perfil Moderate (43.6% vs. 35% alvo). Pode ser oportuno avaliar uma redução gradual de aproximadamente R$27,664 nesta classe.</w:t>
       </w:r>
     </w:p>
-    <w:p/>
     <w:p>
+      <w:pPr>
+        <w:spacing w:line="276" w:lineRule="auto" w:before="40" w:after="40"/>
+      </w:pPr>
       <w:r>
         <w:rPr>
           <w:rFonts w:ascii="Calibri" w:hAnsi="Calibri"/>
           <w:color w:val="333333"/>
-          <w:sz w:val="21"/>
+          <w:sz w:val="20"/>
         </w:rPr>
-        <w:t>A posição em Marfrig (MRFG3) acumula valorização de 43.5%. Pode ser oportuno considerar uma realização parcial de lucros para reequilibrar o portfólio.</w:t>
+        <w:t>A alocação em Multi-Market encontra-se acima do target para o perfil Moderate (26.8% vs. 10% alvo). Pode ser oportuno avaliar uma redução gradual de aproximadamente R$53,917 nesta classe.</w:t>
       </w:r>
     </w:p>
-    <w:p/>
     <w:p>
+      <w:pPr>
+        <w:spacing w:line="276" w:lineRule="auto" w:before="40" w:after="40"/>
+      </w:pPr>
       <w:r>
         <w:rPr>
           <w:rFonts w:ascii="Calibri" w:hAnsi="Calibri"/>
           <w:color w:val="333333"/>
-          <w:sz w:val="21"/>
+          <w:sz w:val="20"/>
         </w:rPr>
-        <w:t>A posição em CDB Banco C6 Consignado SET/2024 (CDB-C6) acumula valorização de 34.9%. Pode ser oportuno considerar uma realização parcial de lucros para reequilibrar o portfólio.</w:t>
+        <w:t>A alocação em REITs está abaixo do nível sugerido para o perfil Moderate (0.0% vs. 15% alvo). Considerando o cenário atual, pode ser interessante avaliar um incremento de aproximadamente R$48,140.</w:t>
       </w:r>
     </w:p>
-    <w:p/>
     <w:p>
+      <w:pPr>
+        <w:spacing w:line="276" w:lineRule="auto" w:before="40" w:after="40"/>
+      </w:pPr>
       <w:r>
         <w:rPr>
           <w:rFonts w:ascii="Calibri" w:hAnsi="Calibri"/>
           <w:color w:val="333333"/>
-          <w:sz w:val="21"/>
+          <w:sz w:val="20"/>
         </w:rPr>
-        <w:t>A posição em Ibiuna Hedge ST Advisory FIC FIM (IBIUNA-HST) acumula valorização de 33.7%. Pode ser oportuno considerar uma realização parcial de lucros para reequilibrar o portfólio.</w:t>
+        <w:t>O cenário de queda de juros abre oportunidades em diversas classes de ativos, mas é importante manter a diversificação e atenção aos riscos geopolíticos (tensões EUA-Irã) e eleitorais (campanha presidencial 2026). Seguimos monitorando o mercado e avaliando oportunidades que possam contribuir para a evolução da sua carteira, sempre respeitando seu perfil de risco e objetivos de investimento.</w:t>
       </w:r>
     </w:p>
-    <w:p/>
     <w:p>
+      <w:pPr>
+        <w:spacing w:line="276" w:lineRule="auto" w:before="40" w:after="40"/>
+      </w:pPr>
       <w:r>
         <w:rPr>
           <w:rFonts w:ascii="Calibri" w:hAnsi="Calibri"/>
           <w:color w:val="333333"/>
-          <w:sz w:val="21"/>
+          <w:sz w:val="20"/>
         </w:rPr>
-        <w:t>Diante do cenário atual, entendemos que a carteira está adequadamente posicionada para navegar o ambiente de juros elevados e desaceleração econômica. Seguimos atentos às oportunidades que possam surgir com a evolução do cenário.</w:t>
+        <w:t>Permaneço à disposição para agendarmos uma conversa e discutirmos em mais detalhes o posicionamento de sua carteira. Não hesite em entrar em contato caso tenha qualquer dúvida.</w:t>
       </w:r>
     </w:p>
-    <w:p/>
     <w:p>
+      <w:pPr>
+        <w:spacing w:line="276" w:lineRule="auto" w:before="120" w:after="40"/>
+      </w:pPr>
       <w:r>
         <w:rPr>
           <w:rFonts w:ascii="Calibri" w:hAnsi="Calibri"/>
           <w:color w:val="333333"/>
-          <w:sz w:val="21"/>
+          <w:sz w:val="20"/>
         </w:rPr>
-        <w:t>Permaneço à disposição para agendarmos uma conversa e discutirmos em mais detalhes o posicionamento de sua carteira.</w:t>
+        <w:t>Atenciosamente,</w:t>
       </w:r>
     </w:p>
-    <w:p/>
     <w:p>
+      <w:pPr>
+        <w:spacing w:line="276" w:lineRule="auto" w:before="40" w:after="40"/>
+      </w:pPr>
       <w:r>
         <w:rPr>
           <w:rFonts w:ascii="Calibri" w:hAnsi="Calibri"/>
           <w:color w:val="333333"/>
-          <w:sz w:val="21"/>
-        </w:rPr>
-        <w:t>Atenciosamente,</w:t>
-      </w:r>
-    </w:p>
-    <w:p/>
-    <w:p>
-      <w:r>
-        <w:rPr>
-          <w:rFonts w:ascii="Calibri" w:hAnsi="Calibri"/>
-          <w:color w:val="333333"/>
-          <w:sz w:val="21"/>
+          <w:sz w:val="20"/>
         </w:rPr>
         <w:t>Carlos Eduardo Martins</w:t>
       </w:r>
     </w:p>
     <w:p>
+      <w:pPr>
+        <w:spacing w:line="276" w:lineRule="auto" w:before="40" w:after="40"/>
+      </w:pPr>
       <w:r>
         <w:rPr>
           <w:rFonts w:ascii="Calibri" w:hAnsi="Calibri"/>
           <w:color w:val="333333"/>
-          <w:sz w:val="21"/>
+          <w:sz w:val="20"/>
         </w:rPr>
         <w:t>CNPI-T 12345</w:t>
       </w:r>
     </w:p>
     <w:p>
+      <w:pPr>
+        <w:spacing w:line="276" w:lineRule="auto" w:before="40" w:after="40"/>
+      </w:pPr>
       <w:r>
         <w:rPr>
           <w:rFonts w:ascii="Calibri" w:hAnsi="Calibri"/>
           <w:color w:val="333333"/>
-          <w:sz w:val="21"/>
+          <w:sz w:val="20"/>
         </w:rPr>
         <w:t>XP Investimentos - Faria Lima</w:t>
       </w:r>
     </w:p>
     <w:p>
+      <w:pPr>
+        <w:spacing w:line="276" w:lineRule="auto" w:before="40" w:after="40"/>
+      </w:pPr>
       <w:r>
         <w:rPr>
           <w:rFonts w:ascii="Calibri" w:hAnsi="Calibri"/>
           <w:color w:val="333333"/>
-          <w:sz w:val="21"/>
+          <w:sz w:val="20"/>
         </w:rPr>
         <w:t>(11) 91234-5678</w:t>
       </w:r>
     </w:p>
-    <w:p/>
     <w:p>
+      <w:pPr>
+        <w:spacing w:line="276" w:lineRule="auto" w:before="80" w:after="40"/>
+      </w:pPr>
       <w:r>
         <w:rPr>
           <w:rFonts w:ascii="Calibri" w:hAnsi="Calibri"/>
           <w:color w:val="CCCCCC"/>
-          <w:sz w:val="12"/>
+          <w:sz w:val="10"/>
         </w:rPr>
-        <w:t>________________________________________________________________________________</w:t>
+        <w:t>__________________________________________________________________________________________</w:t>
       </w:r>
     </w:p>
     <w:p>
+      <w:pPr>
+        <w:spacing w:line="240" w:lineRule="auto" w:before="0" w:after="0"/>
+      </w:pPr>
       <w:r>
         <w:rPr>
           <w:rFonts w:ascii="Calibri" w:hAnsi="Calibri"/>
           <w:i/>
           <w:color w:val="999999"/>
-          <w:sz w:val="16"/>
+          <w:sz w:val="15"/>
         </w:rPr>
         <w:t>Este material é informativo e não constitui recomendação de investimento. Rentabilidade passada não é garantia de retorno futuro. Investimentos envolvem riscos, inclusive de perda do capital investido.</w:t>
       </w:r>
     </w:p>
     <w:sectPr>
       <w:pgSz w:w="12240" w:h="15840"/>
-      <w:pgMar w:top="1417" w:right="1417" w:bottom="1417" w:left="1417" w:header="720" w:footer="720" w:gutter="0"/>
+      <w:pgMar w:top="1134" w:right="1134" w:bottom="850" w:left="1134" w:header="720" w:footer="720" w:gutter="0"/>
       <w:cols w:space="720"/>
       <w:docGrid w:linePitch="360"/>
     </w:sectPr>
@@ -734,6 +779,13 @@
     <w:name w:val="Normal"/>
     <w:qFormat/>
     <w:rsid w:val="00FC693F"/>
+    <w:pPr>
+      <w:spacing w:before="0" w:after="40" w:line="276" w:lineRule="auto"/>
+    </w:pPr>
+    <w:rPr>
+      <w:rFonts w:ascii="Calibri" w:hAnsi="Calibri"/>
+      <w:sz w:val="20"/>
+    </w:rPr>
   </w:style>
   <w:style w:type="paragraph" w:styleId="Header">
     <w:name w:val="header"/>

</xml_diff>